<commit_message>
Harden MissionWeave disclosure and rights tables
</commit_message>
<xml_diff>
--- a/grant_submissions/DLA26BZ03_NV011_MissionWeave/MISSIONWEAVE_DSIP_VOLUME2_FINAL_CANDIDATE_2026-07-16.docx
+++ b/grant_submissions/DLA26BZ03_NV011_MissionWeave/MISSIONWEAVE_DSIP_VOLUME2_FINAL_CANDIDATE_2026-07-16.docx
@@ -5046,17 +5046,467 @@
         <w:t>11. Prior, Current, or Pending Support for Similar Proposals or Awards</w:t>
       </w:r>
     </w:p>
+    <w:tbl>
+      <w:tblPr>
+        <w:tblW w:type="dxa" w:w="9360"/>
+        <w:jc w:val="left"/>
+        <w:tblLayout w:type="fixed"/>
+        <w:tblLook w:firstColumn="1" w:firstRow="1" w:lastColumn="0" w:lastRow="0" w:noHBand="0" w:noVBand="1" w:val="04A0"/>
+        <w:tblInd w:w="120" w:type="dxa"/>
+        <w:tblBorders>
+          <w:top w:val="single" w:sz="4" w:space="0" w:color="AEB7C2"/>
+          <w:left w:val="single" w:sz="4" w:space="0" w:color="AEB7C2"/>
+          <w:bottom w:val="single" w:sz="4" w:space="0" w:color="AEB7C2"/>
+          <w:right w:val="single" w:sz="4" w:space="0" w:color="AEB7C2"/>
+          <w:insideH w:val="single" w:sz="4" w:space="0" w:color="AEB7C2"/>
+          <w:insideV w:val="single" w:sz="4" w:space="0" w:color="AEB7C2"/>
+        </w:tblBorders>
+      </w:tblPr>
+      <w:tblGrid>
+        <w:gridCol w:w="3300"/>
+        <w:gridCol w:w="2500"/>
+        <w:gridCol w:w="3560"/>
+      </w:tblGrid>
+      <w:tr>
+        <w:trPr>
+          <w:cantSplit w:val="true"/>
+          <w:tblHeader w:val="true"/>
+        </w:trPr>
+        <w:tc>
+          <w:tcPr>
+            <w:tcW w:type="dxa" w:w="3300"/>
+            <w:shd w:fill="F2F4F7" w:val="clear"/>
+            <w:tcMar>
+              <w:top w:w="80" w:type="dxa"/>
+              <w:bottom w:w="80" w:type="dxa"/>
+              <w:start w:w="120" w:type="dxa"/>
+              <w:end w:w="120" w:type="dxa"/>
+            </w:tcMar>
+            <w:vAlign w:val="center"/>
+          </w:tcPr>
+          <w:p>
+            <w:pPr>
+              <w:pStyle w:val="TableText"/>
+            </w:pPr>
+            <w:r>
+              <w:rPr>
+                <w:rFonts w:ascii="Arial" w:hAnsi="Arial" w:eastAsia="Arial"/>
+                <w:b/>
+                <w:color w:val="000000"/>
+                <w:sz w:val="20"/>
+              </w:rPr>
+              <w:t>Effort and authoritative identifiers</w:t>
+            </w:r>
+          </w:p>
+        </w:tc>
+        <w:tc>
+          <w:tcPr>
+            <w:tcW w:type="dxa" w:w="2500"/>
+            <w:shd w:fill="F2F4F7" w:val="clear"/>
+            <w:tcMar>
+              <w:top w:w="80" w:type="dxa"/>
+              <w:bottom w:w="80" w:type="dxa"/>
+              <w:start w:w="120" w:type="dxa"/>
+              <w:end w:w="120" w:type="dxa"/>
+            </w:tcMar>
+            <w:vAlign w:val="center"/>
+          </w:tcPr>
+          <w:p>
+            <w:pPr>
+              <w:pStyle w:val="TableText"/>
+            </w:pPr>
+            <w:r>
+              <w:rPr>
+                <w:rFonts w:ascii="Arial" w:hAnsi="Arial" w:eastAsia="Arial"/>
+                <w:b/>
+                <w:color w:val="000000"/>
+                <w:sz w:val="20"/>
+              </w:rPr>
+              <w:t>Submission, award, and PI facts</w:t>
+            </w:r>
+          </w:p>
+        </w:tc>
+        <w:tc>
+          <w:tcPr>
+            <w:tcW w:type="dxa" w:w="3560"/>
+            <w:shd w:fill="F2F4F7" w:val="clear"/>
+            <w:tcMar>
+              <w:top w:w="80" w:type="dxa"/>
+              <w:bottom w:w="80" w:type="dxa"/>
+              <w:start w:w="120" w:type="dxa"/>
+              <w:end w:w="120" w:type="dxa"/>
+            </w:tcMar>
+            <w:vAlign w:val="center"/>
+          </w:tcPr>
+          <w:p>
+            <w:pPr>
+              <w:pStyle w:val="TableText"/>
+            </w:pPr>
+            <w:r>
+              <w:rPr>
+                <w:rFonts w:ascii="Arial" w:hAnsi="Arial" w:eastAsia="Arial"/>
+                <w:b/>
+                <w:color w:val="000000"/>
+                <w:sz w:val="20"/>
+              </w:rPr>
+              <w:t>Relationship to MissionWeave and cost separation</w:t>
+            </w:r>
+          </w:p>
+        </w:tc>
+      </w:tr>
+      <w:tr>
+        <w:trPr>
+          <w:cantSplit w:val="true"/>
+        </w:trPr>
+        <w:tc>
+          <w:tcPr>
+            <w:tcW w:type="dxa" w:w="3300"/>
+            <w:tcMar>
+              <w:top w:w="80" w:type="dxa"/>
+              <w:bottom w:w="80" w:type="dxa"/>
+              <w:start w:w="120" w:type="dxa"/>
+              <w:end w:w="120" w:type="dxa"/>
+            </w:tcMar>
+            <w:vAlign w:val="center"/>
+          </w:tcPr>
+          <w:p>
+            <w:pPr>
+              <w:pStyle w:val="TableText"/>
+            </w:pPr>
+            <w:r>
+              <w:rPr>
+                <w:rFonts w:ascii="Arial" w:hAnsi="Arial" w:eastAsia="Arial"/>
+                <w:b/>
+                <w:color w:val="000000"/>
+                <w:sz w:val="20"/>
+              </w:rPr>
+              <w:t>DICE.</w:t>
+            </w:r>
+            <w:r>
+              <w:rPr>
+                <w:rFonts w:ascii="Arial" w:hAnsi="Arial" w:eastAsia="Arial"/>
+                <w:b w:val="0"/>
+                <w:color w:val="000000"/>
+                <w:sz w:val="20"/>
+              </w:rPr>
+              <w:t xml:space="preserve"> DARPA; Coherence-Bounded Peer Mesh: Sparse Task Markets and Local Inference Control for Resilient Heterogeneous AI Collectives; BAA </w:t>
+            </w:r>
+            <w:r>
+              <w:rPr>
+                <w:rFonts w:ascii="Consolas" w:hAnsi="Consolas" w:eastAsia="Arial"/>
+                <w:b w:val="0"/>
+                <w:color w:val="000000"/>
+                <w:sz w:val="20"/>
+              </w:rPr>
+              <w:t>HR001126S0010</w:t>
+            </w:r>
+            <w:r>
+              <w:rPr>
+                <w:rFonts w:ascii="Arial" w:hAnsi="Arial" w:eastAsia="Arial"/>
+                <w:b w:val="0"/>
+                <w:color w:val="000000"/>
+                <w:sz w:val="20"/>
+              </w:rPr>
+              <w:t>, Decentralized Artificial Intelligence through Controlled Emergence, 2026; TA1 and TA2.</w:t>
+            </w:r>
+          </w:p>
+        </w:tc>
+        <w:tc>
+          <w:tcPr>
+            <w:tcW w:type="dxa" w:w="2500"/>
+            <w:tcMar>
+              <w:top w:w="80" w:type="dxa"/>
+              <w:bottom w:w="80" w:type="dxa"/>
+              <w:start w:w="120" w:type="dxa"/>
+              <w:end w:w="120" w:type="dxa"/>
+            </w:tcMar>
+            <w:vAlign w:val="center"/>
+          </w:tcPr>
+          <w:p>
+            <w:pPr>
+              <w:pStyle w:val="TableText"/>
+            </w:pPr>
+            <w:r>
+              <w:rPr>
+                <w:rFonts w:ascii="Arial" w:hAnsi="Arial" w:eastAsia="Arial"/>
+                <w:b w:val="0"/>
+                <w:color w:val="000000"/>
+                <w:sz w:val="20"/>
+              </w:rPr>
+              <w:t>Abstract submitted June 30, 2026; full proposal planned but not submitted as of July 18, 2026. No award or contract number identified. PI: Robert Ashworth, Founder and Principal Investigator.</w:t>
+            </w:r>
+          </w:p>
+        </w:tc>
+        <w:tc>
+          <w:tcPr>
+            <w:tcW w:type="dxa" w:w="3560"/>
+            <w:tcMar>
+              <w:top w:w="80" w:type="dxa"/>
+              <w:bottom w:w="80" w:type="dxa"/>
+              <w:start w:w="120" w:type="dxa"/>
+              <w:end w:w="120" w:type="dxa"/>
+            </w:tcMar>
+            <w:vAlign w:val="center"/>
+          </w:tcPr>
+          <w:p>
+            <w:pPr>
+              <w:pStyle w:val="TableText"/>
+            </w:pPr>
+            <w:r>
+              <w:rPr>
+                <w:rFonts w:ascii="Arial" w:hAnsi="Arial" w:eastAsia="Arial"/>
+                <w:b w:val="0"/>
+                <w:color w:val="000000"/>
+                <w:sz w:val="20"/>
+              </w:rPr>
+              <w:t>DICE concerns decentralized heterogeneous-agent coordination, local inference control, and adversarial team evaluation. MissionWeave concerns one bounded DLA organizational process POC, business case, and transition roadmap. No MissionWeave PI hour, cloud/software charge, or deliverable is requested under DICE.</w:t>
+            </w:r>
+          </w:p>
+        </w:tc>
+      </w:tr>
+      <w:tr>
+        <w:trPr>
+          <w:cantSplit w:val="true"/>
+        </w:trPr>
+        <w:tc>
+          <w:tcPr>
+            <w:tcW w:type="dxa" w:w="3300"/>
+            <w:tcMar>
+              <w:top w:w="80" w:type="dxa"/>
+              <w:bottom w:w="80" w:type="dxa"/>
+              <w:start w:w="120" w:type="dxa"/>
+              <w:end w:w="120" w:type="dxa"/>
+            </w:tcMar>
+            <w:vAlign w:val="center"/>
+          </w:tcPr>
+          <w:p>
+            <w:pPr>
+              <w:pStyle w:val="TableText"/>
+            </w:pPr>
+            <w:r>
+              <w:rPr>
+                <w:rFonts w:ascii="Arial" w:hAnsi="Arial" w:eastAsia="Arial"/>
+                <w:b/>
+                <w:color w:val="000000"/>
+                <w:sz w:val="20"/>
+              </w:rPr>
+              <w:t>HarborSentinel.</w:t>
+            </w:r>
+            <w:r>
+              <w:rPr>
+                <w:rFonts w:ascii="Arial" w:hAnsi="Arial" w:eastAsia="Arial"/>
+                <w:b w:val="0"/>
+                <w:color w:val="000000"/>
+                <w:sz w:val="20"/>
+              </w:rPr>
+              <w:t xml:space="preserve"> Department of the Navy; HarborSentinel: Explainable Low-Storage Pattern-of-Life Analysis for Congested Maritime Environments; DoW SBIR 2026 BAA Release 3, topic </w:t>
+            </w:r>
+            <w:r>
+              <w:rPr>
+                <w:rFonts w:ascii="Consolas" w:hAnsi="Consolas" w:eastAsia="Arial"/>
+                <w:b w:val="0"/>
+                <w:color w:val="000000"/>
+                <w:sz w:val="20"/>
+              </w:rPr>
+              <w:t>DON26BZ03-NV063</w:t>
+            </w:r>
+            <w:r>
+              <w:rPr>
+                <w:rFonts w:ascii="Arial" w:hAnsi="Arial" w:eastAsia="Arial"/>
+                <w:b w:val="0"/>
+                <w:color w:val="000000"/>
+                <w:sz w:val="20"/>
+              </w:rPr>
+              <w:t>.</w:t>
+            </w:r>
+          </w:p>
+        </w:tc>
+        <w:tc>
+          <w:tcPr>
+            <w:tcW w:type="dxa" w:w="2500"/>
+            <w:tcMar>
+              <w:top w:w="80" w:type="dxa"/>
+              <w:bottom w:w="80" w:type="dxa"/>
+              <w:start w:w="120" w:type="dxa"/>
+              <w:end w:w="120" w:type="dxa"/>
+            </w:tcMar>
+            <w:vAlign w:val="center"/>
+          </w:tcPr>
+          <w:p>
+            <w:pPr>
+              <w:pStyle w:val="TableText"/>
+            </w:pPr>
+            <w:r>
+              <w:rPr>
+                <w:rFonts w:ascii="Arial" w:hAnsi="Arial" w:eastAsia="Arial"/>
+                <w:b w:val="0"/>
+                <w:color w:val="000000"/>
+                <w:sz w:val="20"/>
+              </w:rPr>
+              <w:t>Planned; not submitted as of July 18, 2026. No award or contract number identified. PI: Robert Ashworth, Founder and Principal Investigator.</w:t>
+            </w:r>
+          </w:p>
+        </w:tc>
+        <w:tc>
+          <w:tcPr>
+            <w:tcW w:type="dxa" w:w="3560"/>
+            <w:tcMar>
+              <w:top w:w="80" w:type="dxa"/>
+              <w:bottom w:w="80" w:type="dxa"/>
+              <w:start w:w="120" w:type="dxa"/>
+              <w:end w:w="120" w:type="dxa"/>
+            </w:tcMar>
+            <w:vAlign w:val="center"/>
+          </w:tcPr>
+          <w:p>
+            <w:pPr>
+              <w:pStyle w:val="TableText"/>
+            </w:pPr>
+            <w:r>
+              <w:rPr>
+                <w:rFonts w:ascii="Arial" w:hAnsi="Arial" w:eastAsia="Arial"/>
+                <w:b w:val="0"/>
+                <w:color w:val="000000"/>
+                <w:sz w:val="20"/>
+              </w:rPr>
+              <w:t>HarborSentinel concerns maritime AIS, ADS-B, notional-radar, and composite-track anomaly review plus an SSDS transition concept. MissionWeave does not fund maritime adapters, threat-candidate logic, SSDS interfaces, or maritime-data evaluation.</w:t>
+            </w:r>
+          </w:p>
+        </w:tc>
+      </w:tr>
+      <w:tr>
+        <w:trPr>
+          <w:cantSplit w:val="true"/>
+        </w:trPr>
+        <w:tc>
+          <w:tcPr>
+            <w:tcW w:type="dxa" w:w="3300"/>
+            <w:tcMar>
+              <w:top w:w="80" w:type="dxa"/>
+              <w:bottom w:w="80" w:type="dxa"/>
+              <w:start w:w="120" w:type="dxa"/>
+              <w:end w:w="120" w:type="dxa"/>
+            </w:tcMar>
+            <w:vAlign w:val="center"/>
+          </w:tcPr>
+          <w:p>
+            <w:pPr>
+              <w:pStyle w:val="TableText"/>
+            </w:pPr>
+            <w:r>
+              <w:rPr>
+                <w:rFonts w:ascii="Arial" w:hAnsi="Arial" w:eastAsia="Arial"/>
+                <w:b/>
+                <w:color w:val="000000"/>
+                <w:sz w:val="20"/>
+              </w:rPr>
+              <w:t>FALCON.</w:t>
+            </w:r>
+            <w:r>
+              <w:rPr>
+                <w:rFonts w:ascii="Arial" w:hAnsi="Arial" w:eastAsia="Arial"/>
+                <w:b w:val="0"/>
+                <w:color w:val="000000"/>
+                <w:sz w:val="20"/>
+              </w:rPr>
+              <w:t xml:space="preserve"> DARPA; Fusion of Abstract Learning and Context-Optimized Neural-methods (FALCON); DoW SBIR 2026 BAA Release 4, topic </w:t>
+            </w:r>
+            <w:r>
+              <w:rPr>
+                <w:rFonts w:ascii="Consolas" w:hAnsi="Consolas" w:eastAsia="Arial"/>
+                <w:b w:val="0"/>
+                <w:color w:val="000000"/>
+                <w:sz w:val="20"/>
+              </w:rPr>
+              <w:t>DPA26BZ04-DV016</w:t>
+            </w:r>
+            <w:r>
+              <w:rPr>
+                <w:rFonts w:ascii="Arial" w:hAnsi="Arial" w:eastAsia="Arial"/>
+                <w:b w:val="0"/>
+                <w:color w:val="000000"/>
+                <w:sz w:val="20"/>
+              </w:rPr>
+              <w:t>.</w:t>
+            </w:r>
+          </w:p>
+        </w:tc>
+        <w:tc>
+          <w:tcPr>
+            <w:tcW w:type="dxa" w:w="2500"/>
+            <w:tcMar>
+              <w:top w:w="80" w:type="dxa"/>
+              <w:bottom w:w="80" w:type="dxa"/>
+              <w:start w:w="120" w:type="dxa"/>
+              <w:end w:w="120" w:type="dxa"/>
+            </w:tcMar>
+            <w:vAlign w:val="center"/>
+          </w:tcPr>
+          <w:p>
+            <w:pPr>
+              <w:pStyle w:val="TableText"/>
+            </w:pPr>
+            <w:r>
+              <w:rPr>
+                <w:rFonts w:ascii="Arial" w:hAnsi="Arial" w:eastAsia="Arial"/>
+                <w:b w:val="0"/>
+                <w:color w:val="000000"/>
+                <w:sz w:val="20"/>
+              </w:rPr>
+              <w:t xml:space="preserve">Direct-to-Phase-II working package; not submitted as of July 18, 2026. Local final-submission decision is </w:t>
+            </w:r>
+            <w:r>
+              <w:rPr>
+                <w:rFonts w:ascii="Consolas" w:hAnsi="Consolas" w:eastAsia="Arial"/>
+                <w:b w:val="0"/>
+                <w:color w:val="000000"/>
+                <w:sz w:val="20"/>
+              </w:rPr>
+              <w:t>NO-GO</w:t>
+            </w:r>
+            <w:r>
+              <w:rPr>
+                <w:rFonts w:ascii="Arial" w:hAnsi="Arial" w:eastAsia="Arial"/>
+                <w:b w:val="0"/>
+                <w:color w:val="000000"/>
+                <w:sz w:val="20"/>
+              </w:rPr>
+              <w:t>. No award or contract number identified. PI: Robert Ashworth, Founder and Principal Investigator.</w:t>
+            </w:r>
+          </w:p>
+        </w:tc>
+        <w:tc>
+          <w:tcPr>
+            <w:tcW w:type="dxa" w:w="3560"/>
+            <w:tcMar>
+              <w:top w:w="80" w:type="dxa"/>
+              <w:bottom w:w="80" w:type="dxa"/>
+              <w:start w:w="120" w:type="dxa"/>
+              <w:end w:w="120" w:type="dxa"/>
+            </w:tcMar>
+            <w:vAlign w:val="center"/>
+          </w:tcPr>
+          <w:p>
+            <w:pPr>
+              <w:pStyle w:val="TableText"/>
+            </w:pPr>
+            <w:r>
+              <w:rPr>
+                <w:rFonts w:ascii="Arial" w:hAnsi="Arial" w:eastAsia="Arial"/>
+                <w:b w:val="0"/>
+                <w:color w:val="000000"/>
+                <w:sz w:val="20"/>
+              </w:rPr>
+              <w:t>FALCON concerns same-row ML-only, LLM-only, and hybrid comparisons on reserved two-domain holdouts plus hallucination, abstention, and scale measurement. MissionWeave does not fund FALCON model-fusion experiments or Direct-to-Phase-II feasibility evidence.</w:t>
+            </w:r>
+          </w:p>
+        </w:tc>
+      </w:tr>
+    </w:tbl>
     <w:p>
-      <w:pPr/>
-      <w:r>
-        <w:rPr>
-          <w:rFonts w:ascii="Arial" w:hAnsi="Arial" w:eastAsia="Arial"/>
-          <w:b w:val="0"/>
-          <w:color w:val="000000"/>
-          <w:sz w:val="21"/>
-        </w:rPr>
-        <w:t>The applicant will disclose all prior, current, and pending support in the required DSIP fields and attachments after comparing this statement of work with every live or planned submission. MissionWeave is scoped to a bounded organizational process twin, use-case ranking, data/synthetic plan, POC, business case, and MVP roadmap. No duplicate payment is requested for PI hours, cloud/software costs, or deliverables funded by another award.</w:t>
-      </w:r>
+      <w:pPr>
+        <w:spacing w:after="40" w:line="240" w:lineRule="auto"/>
+      </w:pPr>
     </w:p>
     <w:p>
       <w:pPr/>
@@ -5067,7 +5517,7 @@
           <w:color w:val="000000"/>
           <w:sz w:val="21"/>
         </w:rPr>
-        <w:t>The corporate official will review potentially related DICE, HarborSentinel, FALCON, and other LumenCore submissions before certification. Shared background software will be identified as background technology; proposal-specific tasks, deliverables, and costs will be separated. This section does not assert that no similar proposal exists and does not replace the certified portal disclosure.</w:t>
+        <w:t>No prior, current, or pending award was identified as providing financial support for the MissionWeave tasks in this proposal. Shared LumenCore software is background technology; the proposed funds are for the DLA-specific process definition, adapters, evaluation, POC, business case, and transition outputs. The applicant will maintain proposal/task/day labor records and project-specific charge and deliverable ledgers. The corporate official must reconcile this table with every authoritative portal entry before certification and remove or disclose any newly identified overlap.</w:t>
       </w:r>
     </w:p>
     <w:p>
@@ -5084,17 +5534,365 @@
         <w:t>12. Technical Data and Software Rights Assertions</w:t>
       </w:r>
     </w:p>
+    <w:tbl>
+      <w:tblPr>
+        <w:tblW w:type="dxa" w:w="9360"/>
+        <w:jc w:val="left"/>
+        <w:tblLayout w:type="fixed"/>
+        <w:tblLook w:firstColumn="1" w:firstRow="1" w:lastColumn="0" w:lastRow="0" w:noHBand="0" w:noVBand="1" w:val="04A0"/>
+        <w:tblInd w:w="120" w:type="dxa"/>
+        <w:tblBorders>
+          <w:top w:val="single" w:sz="4" w:space="0" w:color="AEB7C2"/>
+          <w:left w:val="single" w:sz="4" w:space="0" w:color="AEB7C2"/>
+          <w:bottom w:val="single" w:sz="4" w:space="0" w:color="AEB7C2"/>
+          <w:right w:val="single" w:sz="4" w:space="0" w:color="AEB7C2"/>
+          <w:insideH w:val="single" w:sz="4" w:space="0" w:color="AEB7C2"/>
+          <w:insideV w:val="single" w:sz="4" w:space="0" w:color="AEB7C2"/>
+        </w:tblBorders>
+      </w:tblPr>
+      <w:tblGrid>
+        <w:gridCol w:w="3200"/>
+        <w:gridCol w:w="2300"/>
+        <w:gridCol w:w="1850"/>
+        <w:gridCol w:w="2010"/>
+      </w:tblGrid>
+      <w:tr>
+        <w:trPr>
+          <w:cantSplit w:val="true"/>
+          <w:tblHeader w:val="true"/>
+        </w:trPr>
+        <w:tc>
+          <w:tcPr>
+            <w:tcW w:type="dxa" w:w="3200"/>
+            <w:shd w:fill="F2F4F7" w:val="clear"/>
+            <w:tcMar>
+              <w:top w:w="80" w:type="dxa"/>
+              <w:bottom w:w="80" w:type="dxa"/>
+              <w:start w:w="120" w:type="dxa"/>
+              <w:end w:w="120" w:type="dxa"/>
+            </w:tcMar>
+            <w:vAlign w:val="center"/>
+          </w:tcPr>
+          <w:p>
+            <w:pPr>
+              <w:pStyle w:val="TableText"/>
+            </w:pPr>
+            <w:r>
+              <w:rPr>
+                <w:rFonts w:ascii="Arial" w:hAnsi="Arial" w:eastAsia="Arial"/>
+                <w:b/>
+                <w:color w:val="000000"/>
+                <w:sz w:val="20"/>
+              </w:rPr>
+              <w:t>Technical data or computer software to be furnished with restrictions</w:t>
+            </w:r>
+          </w:p>
+        </w:tc>
+        <w:tc>
+          <w:tcPr>
+            <w:tcW w:type="dxa" w:w="2300"/>
+            <w:shd w:fill="F2F4F7" w:val="clear"/>
+            <w:tcMar>
+              <w:top w:w="80" w:type="dxa"/>
+              <w:bottom w:w="80" w:type="dxa"/>
+              <w:start w:w="120" w:type="dxa"/>
+              <w:end w:w="120" w:type="dxa"/>
+            </w:tcMar>
+            <w:vAlign w:val="center"/>
+          </w:tcPr>
+          <w:p>
+            <w:pPr>
+              <w:pStyle w:val="TableText"/>
+            </w:pPr>
+            <w:r>
+              <w:rPr>
+                <w:rFonts w:ascii="Arial" w:hAnsi="Arial" w:eastAsia="Arial"/>
+                <w:b/>
+                <w:color w:val="000000"/>
+                <w:sz w:val="20"/>
+              </w:rPr>
+              <w:t>Basis for assertion</w:t>
+            </w:r>
+          </w:p>
+        </w:tc>
+        <w:tc>
+          <w:tcPr>
+            <w:tcW w:type="dxa" w:w="1850"/>
+            <w:shd w:fill="F2F4F7" w:val="clear"/>
+            <w:tcMar>
+              <w:top w:w="80" w:type="dxa"/>
+              <w:bottom w:w="80" w:type="dxa"/>
+              <w:start w:w="120" w:type="dxa"/>
+              <w:end w:w="120" w:type="dxa"/>
+            </w:tcMar>
+            <w:vAlign w:val="center"/>
+          </w:tcPr>
+          <w:p>
+            <w:pPr>
+              <w:pStyle w:val="TableText"/>
+            </w:pPr>
+            <w:r>
+              <w:rPr>
+                <w:rFonts w:ascii="Arial" w:hAnsi="Arial" w:eastAsia="Arial"/>
+                <w:b/>
+                <w:color w:val="000000"/>
+                <w:sz w:val="20"/>
+              </w:rPr>
+              <w:t>Asserted rights category</w:t>
+            </w:r>
+          </w:p>
+        </w:tc>
+        <w:tc>
+          <w:tcPr>
+            <w:tcW w:type="dxa" w:w="2010"/>
+            <w:shd w:fill="F2F4F7" w:val="clear"/>
+            <w:tcMar>
+              <w:top w:w="80" w:type="dxa"/>
+              <w:bottom w:w="80" w:type="dxa"/>
+              <w:start w:w="120" w:type="dxa"/>
+              <w:end w:w="120" w:type="dxa"/>
+            </w:tcMar>
+            <w:vAlign w:val="center"/>
+          </w:tcPr>
+          <w:p>
+            <w:pPr>
+              <w:pStyle w:val="TableText"/>
+            </w:pPr>
+            <w:r>
+              <w:rPr>
+                <w:rFonts w:ascii="Arial" w:hAnsi="Arial" w:eastAsia="Arial"/>
+                <w:b/>
+                <w:color w:val="000000"/>
+                <w:sz w:val="20"/>
+              </w:rPr>
+              <w:t>Person or organization asserting restrictions</w:t>
+            </w:r>
+          </w:p>
+        </w:tc>
+      </w:tr>
+      <w:tr>
+        <w:trPr>
+          <w:cantSplit w:val="true"/>
+        </w:trPr>
+        <w:tc>
+          <w:tcPr>
+            <w:tcW w:type="dxa" w:w="3200"/>
+            <w:tcMar>
+              <w:top w:w="80" w:type="dxa"/>
+              <w:bottom w:w="80" w:type="dxa"/>
+              <w:start w:w="120" w:type="dxa"/>
+              <w:end w:w="120" w:type="dxa"/>
+            </w:tcMar>
+            <w:vAlign w:val="center"/>
+          </w:tcPr>
+          <w:p>
+            <w:pPr>
+              <w:pStyle w:val="TableText"/>
+            </w:pPr>
+            <w:r>
+              <w:rPr>
+                <w:rFonts w:ascii="Arial" w:hAnsi="Arial" w:eastAsia="Arial"/>
+                <w:b w:val="0"/>
+                <w:color w:val="000000"/>
+                <w:sz w:val="20"/>
+              </w:rPr>
+              <w:t>Pre-existing LumenCore computer-software components, only to the extent furnished: deterministic configuration and replay; source/provenance adapters; baseline and holdout evaluation; constrained routing and abstention; SHA-256 evidence-manifest logic; and benchmark harnesses.</w:t>
+            </w:r>
+          </w:p>
+        </w:tc>
+        <w:tc>
+          <w:tcPr>
+            <w:tcW w:type="dxa" w:w="2300"/>
+            <w:tcMar>
+              <w:top w:w="80" w:type="dxa"/>
+              <w:bottom w:w="80" w:type="dxa"/>
+              <w:start w:w="120" w:type="dxa"/>
+              <w:end w:w="120" w:type="dxa"/>
+            </w:tcMar>
+            <w:vAlign w:val="center"/>
+          </w:tcPr>
+          <w:p>
+            <w:pPr>
+              <w:pStyle w:val="TableText"/>
+            </w:pPr>
+            <w:r>
+              <w:rPr>
+                <w:rFonts w:ascii="Arial" w:hAnsi="Arial" w:eastAsia="Arial"/>
+                <w:b w:val="0"/>
+                <w:color w:val="000000"/>
+                <w:sz w:val="20"/>
+              </w:rPr>
+              <w:t>Developed exclusively at private expense before any resulting award. Only components supported by dated source, funding-history, and authorship records may remain in the final assertion.</w:t>
+            </w:r>
+          </w:p>
+        </w:tc>
+        <w:tc>
+          <w:tcPr>
+            <w:tcW w:type="dxa" w:w="1850"/>
+            <w:tcMar>
+              <w:top w:w="80" w:type="dxa"/>
+              <w:bottom w:w="80" w:type="dxa"/>
+              <w:start w:w="120" w:type="dxa"/>
+              <w:end w:w="120" w:type="dxa"/>
+            </w:tcMar>
+            <w:vAlign w:val="center"/>
+          </w:tcPr>
+          <w:p>
+            <w:pPr>
+              <w:pStyle w:val="TableText"/>
+            </w:pPr>
+            <w:r>
+              <w:rPr>
+                <w:rFonts w:ascii="Arial" w:hAnsi="Arial" w:eastAsia="Arial"/>
+                <w:b w:val="0"/>
+                <w:color w:val="000000"/>
+                <w:sz w:val="20"/>
+              </w:rPr>
+              <w:t>Restricted Rights in computer software, as applicable under R-DFARS 252.227-7992; SBIR/STTR Data Rights for proposal-specific software developed under a resulting award.</w:t>
+            </w:r>
+          </w:p>
+        </w:tc>
+        <w:tc>
+          <w:tcPr>
+            <w:tcW w:type="dxa" w:w="2010"/>
+            <w:tcMar>
+              <w:top w:w="80" w:type="dxa"/>
+              <w:bottom w:w="80" w:type="dxa"/>
+              <w:start w:w="120" w:type="dxa"/>
+              <w:end w:w="120" w:type="dxa"/>
+            </w:tcMar>
+            <w:vAlign w:val="center"/>
+          </w:tcPr>
+          <w:p>
+            <w:pPr>
+              <w:pStyle w:val="TableText"/>
+            </w:pPr>
+            <w:r>
+              <w:rPr>
+                <w:rFonts w:ascii="Arial" w:hAnsi="Arial" w:eastAsia="Arial"/>
+                <w:b w:val="0"/>
+                <w:color w:val="000000"/>
+                <w:sz w:val="20"/>
+              </w:rPr>
+              <w:t>Robert Ashworth d/b/a LumenCore.</w:t>
+            </w:r>
+          </w:p>
+        </w:tc>
+      </w:tr>
+      <w:tr>
+        <w:trPr>
+          <w:cantSplit w:val="true"/>
+        </w:trPr>
+        <w:tc>
+          <w:tcPr>
+            <w:tcW w:type="dxa" w:w="3200"/>
+            <w:tcMar>
+              <w:top w:w="80" w:type="dxa"/>
+              <w:bottom w:w="80" w:type="dxa"/>
+              <w:start w:w="120" w:type="dxa"/>
+              <w:end w:w="120" w:type="dxa"/>
+            </w:tcMar>
+            <w:vAlign w:val="center"/>
+          </w:tcPr>
+          <w:p>
+            <w:pPr>
+              <w:pStyle w:val="TableText"/>
+            </w:pPr>
+            <w:r>
+              <w:rPr>
+                <w:rFonts w:ascii="Arial" w:hAnsi="Arial" w:eastAsia="Arial"/>
+                <w:b w:val="0"/>
+                <w:color w:val="000000"/>
+                <w:sz w:val="20"/>
+              </w:rPr>
+              <w:t>Pre-existing LumenCore technical data, only to the extent furnished: configuration schemas; scenario definitions; metric dictionaries; benchmark manifests; and evidence-receipt definitions.</w:t>
+            </w:r>
+          </w:p>
+        </w:tc>
+        <w:tc>
+          <w:tcPr>
+            <w:tcW w:type="dxa" w:w="2300"/>
+            <w:tcMar>
+              <w:top w:w="80" w:type="dxa"/>
+              <w:bottom w:w="80" w:type="dxa"/>
+              <w:start w:w="120" w:type="dxa"/>
+              <w:end w:w="120" w:type="dxa"/>
+            </w:tcMar>
+            <w:vAlign w:val="center"/>
+          </w:tcPr>
+          <w:p>
+            <w:pPr>
+              <w:pStyle w:val="TableText"/>
+            </w:pPr>
+            <w:r>
+              <w:rPr>
+                <w:rFonts w:ascii="Arial" w:hAnsi="Arial" w:eastAsia="Arial"/>
+                <w:b w:val="0"/>
+                <w:color w:val="000000"/>
+                <w:sz w:val="20"/>
+              </w:rPr>
+              <w:t>Developed exclusively at private expense before any resulting award. Only items supported by dated source, funding-history, and authorship records may remain in the final assertion.</w:t>
+            </w:r>
+          </w:p>
+        </w:tc>
+        <w:tc>
+          <w:tcPr>
+            <w:tcW w:type="dxa" w:w="1850"/>
+            <w:tcMar>
+              <w:top w:w="80" w:type="dxa"/>
+              <w:bottom w:w="80" w:type="dxa"/>
+              <w:start w:w="120" w:type="dxa"/>
+              <w:end w:w="120" w:type="dxa"/>
+            </w:tcMar>
+            <w:vAlign w:val="center"/>
+          </w:tcPr>
+          <w:p>
+            <w:pPr>
+              <w:pStyle w:val="TableText"/>
+            </w:pPr>
+            <w:r>
+              <w:rPr>
+                <w:rFonts w:ascii="Arial" w:hAnsi="Arial" w:eastAsia="Arial"/>
+                <w:b w:val="0"/>
+                <w:color w:val="000000"/>
+                <w:sz w:val="20"/>
+              </w:rPr>
+              <w:t>Limited Rights in technical data, as applicable under R-DFARS 252.227-7992; SBIR/STTR Data Rights for proposal-specific technical data developed under a resulting award.</w:t>
+            </w:r>
+          </w:p>
+        </w:tc>
+        <w:tc>
+          <w:tcPr>
+            <w:tcW w:type="dxa" w:w="2010"/>
+            <w:tcMar>
+              <w:top w:w="80" w:type="dxa"/>
+              <w:bottom w:w="80" w:type="dxa"/>
+              <w:start w:w="120" w:type="dxa"/>
+              <w:end w:w="120" w:type="dxa"/>
+            </w:tcMar>
+            <w:vAlign w:val="center"/>
+          </w:tcPr>
+          <w:p>
+            <w:pPr>
+              <w:pStyle w:val="TableText"/>
+            </w:pPr>
+            <w:r>
+              <w:rPr>
+                <w:rFonts w:ascii="Arial" w:hAnsi="Arial" w:eastAsia="Arial"/>
+                <w:b w:val="0"/>
+                <w:color w:val="000000"/>
+                <w:sz w:val="20"/>
+              </w:rPr>
+              <w:t>Robert Ashworth d/b/a LumenCore.</w:t>
+            </w:r>
+          </w:p>
+        </w:tc>
+      </w:tr>
+    </w:tbl>
     <w:p>
-      <w:pPr/>
-      <w:r>
-        <w:rPr>
-          <w:rFonts w:ascii="Arial" w:hAnsi="Arial" w:eastAsia="Arial"/>
-          <w:b w:val="0"/>
-          <w:color w:val="000000"/>
-          <w:sz w:val="21"/>
-        </w:rPr>
-        <w:t>The applicant expects to identify privately developed MissionWeave/LumenCore source code, configuration schemas, scenario definitions, evidence-manifest logic, and benchmark-harness components in the solicitation's required assertion format. Public standards, solicitation text, Government-furnished information, open-source dependencies, and documented Government-use interfaces will not be mislabeled as privately developed restrictions.</w:t>
-      </w:r>
+      <w:pPr>
+        <w:spacing w:after="40" w:line="240" w:lineRule="auto"/>
+      </w:pPr>
     </w:p>
     <w:p>
       <w:pPr/>
@@ -5105,7 +5903,7 @@
           <w:color w:val="000000"/>
           <w:sz w:val="21"/>
         </w:rPr>
-        <w:t>The final item-by-item assertion, development-funding basis, asserted-rights category, responsible person, and supporting record will be reviewed before submission. No patent, registration, SBIR data-rights period, privately funded development history, or restriction is claimed here beyond what the final documented assertion supports. The Government will receive the rights required by the resulting contract.</w:t>
+        <w:t>Public standards, solicitation text, Government-furnished information, open-source dependencies, and documented Government-use interfaces are not asserted as privately developed restrictions. If the final review cannot support an item or category, that row will be removed or corrected before certification. Completion of this table constitutes the proposal assertion under the BAA; therefore, the corporate official must review the item list, development-funding basis, category, and supporting records before submission. This table does not assert a patent, registration, Government validation, or restriction beyond the listed and supported items.</w:t>
       </w:r>
     </w:p>
     <w:p>

</xml_diff>